<commit_message>
working on sw block
</commit_message>
<xml_diff>
--- a/ADC_LCD/report/Microcontroller_ADC_LCD.docx
+++ b/ADC_LCD/report/Microcontroller_ADC_LCD.docx
@@ -382,7 +382,25 @@
           <w:iCs/>
           <w:sz w:val="24"/>
         </w:rPr>
-        <w:t xml:space="preserve"> (by doing an Altium schematic now, you will save time in the Final Project)</w:t>
+        <w:t xml:space="preserve"> (by doing an Altium schematic now, you will save time </w:t>
+      </w:r>
+      <w:proofErr w:type="gramStart"/>
+      <w:r>
+        <w:rPr>
+          <w:i/>
+          <w:iCs/>
+          <w:sz w:val="24"/>
+        </w:rPr>
+        <w:t>in</w:t>
+      </w:r>
+      <w:proofErr w:type="gramEnd"/>
+      <w:r>
+        <w:rPr>
+          <w:i/>
+          <w:iCs/>
+          <w:sz w:val="24"/>
+        </w:rPr>
+        <w:t xml:space="preserve"> the Final Project)</w:t>
       </w:r>
     </w:p>
     <w:p>
@@ -1083,6 +1101,121 @@
     </w:p>
     <w:p>
       <w:pPr>
+        <w:suppressAutoHyphens w:val="0"/>
+        <w:spacing w:after="160" w:line="259" w:lineRule="auto"/>
+        <w:rPr>
+          <w:sz w:val="24"/>
+        </w:rPr>
+      </w:pPr>
+    </w:p>
+    <w:p>
+      <w:pPr>
+        <w:keepNext/>
+        <w:suppressAutoHyphens w:val="0"/>
+        <w:spacing w:after="160" w:line="259" w:lineRule="auto"/>
+      </w:pPr>
+      <w:r>
+        <w:drawing>
+          <wp:inline distT="0" distB="0" distL="0" distR="0" wp14:anchorId="0AE3A777" wp14:editId="45EC6291">
+            <wp:extent cx="5943600" cy="4082415"/>
+            <wp:effectExtent l="0" t="0" r="0" b="0"/>
+            <wp:docPr id="530145745" name="Picture 1" descr="The image illustrates a circuit diagram for the Raspberry Pi Pico 2, including components such as a 16x2 LCD, a 560pF capacitor, a 33kohm resistor, a RPot, and an ADC with a 0.1uF capacitor.&#10;&#10;AI-generated content may be incorrect."/>
+            <wp:cNvGraphicFramePr>
+              <a:graphicFrameLocks xmlns:a="http://schemas.openxmlformats.org/drawingml/2006/main" noChangeAspect="1"/>
+            </wp:cNvGraphicFramePr>
+            <a:graphic xmlns:a="http://schemas.openxmlformats.org/drawingml/2006/main">
+              <a:graphicData uri="http://schemas.openxmlformats.org/drawingml/2006/picture">
+                <pic:pic xmlns:pic="http://schemas.openxmlformats.org/drawingml/2006/picture">
+                  <pic:nvPicPr>
+                    <pic:cNvPr id="530145745" name="Picture 1" descr="The image illustrates a circuit diagram for the Raspberry Pi Pico 2, including components such as a 16x2 LCD, a 560pF capacitor, a 33kohm resistor, a RPot, and an ADC with a 0.1uF capacitor.&#10;&#10;AI-generated content may be incorrect."/>
+                    <pic:cNvPicPr/>
+                  </pic:nvPicPr>
+                  <pic:blipFill>
+                    <a:blip r:embed="rId10"/>
+                    <a:stretch>
+                      <a:fillRect/>
+                    </a:stretch>
+                  </pic:blipFill>
+                  <pic:spPr>
+                    <a:xfrm>
+                      <a:off x="0" y="0"/>
+                      <a:ext cx="5943600" cy="4082415"/>
+                    </a:xfrm>
+                    <a:prstGeom prst="rect">
+                      <a:avLst/>
+                    </a:prstGeom>
+                  </pic:spPr>
+                </pic:pic>
+              </a:graphicData>
+            </a:graphic>
+          </wp:inline>
+        </w:drawing>
+      </w:r>
+    </w:p>
+    <w:p>
+      <w:pPr>
+        <w:pStyle w:val="Caption"/>
+        <w:jc w:val="center"/>
+      </w:pPr>
+      <w:r>
+        <w:t xml:space="preserve">Figure </w:t>
+      </w:r>
+      <w:fldSimple w:instr=" SEQ Figure \* ARABIC ">
+        <w:r>
+          <w:rPr>
+            <w:noProof/>
+          </w:rPr>
+          <w:t>1</w:t>
+        </w:r>
+      </w:fldSimple>
+      <w:r>
+        <w:t>: Hardware Block Diagram</w:t>
+      </w:r>
+    </w:p>
+    <w:p>
+      <w:pPr>
+        <w:pStyle w:val="Caption"/>
+        <w:jc w:val="center"/>
+        <w:rPr>
+          <w:i w:val="0"/>
+          <w:iCs w:val="0"/>
+        </w:rPr>
+      </w:pPr>
+    </w:p>
+    <w:p>
+      <w:pPr>
+        <w:pStyle w:val="Caption"/>
+        <w:jc w:val="center"/>
+        <w:rPr>
+          <w:i w:val="0"/>
+          <w:iCs w:val="0"/>
+        </w:rPr>
+      </w:pPr>
+    </w:p>
+    <w:p>
+      <w:pPr>
+        <w:pStyle w:val="Caption"/>
+        <w:jc w:val="center"/>
+      </w:pPr>
+    </w:p>
+    <w:p>
+      <w:pPr>
+        <w:pStyle w:val="Caption"/>
+        <w:jc w:val="center"/>
+      </w:pPr>
+    </w:p>
+    <w:p>
+      <w:pPr>
+        <w:pStyle w:val="Caption"/>
+        <w:jc w:val="center"/>
+        <w:rPr>
+          <w:i w:val="0"/>
+          <w:iCs w:val="0"/>
+        </w:rPr>
+      </w:pPr>
+    </w:p>
+    <w:p>
+      <w:pPr>
         <w:spacing w:after="0"/>
         <w:rPr>
           <w:sz w:val="24"/>
@@ -1233,7 +1366,44 @@
           <w:iCs/>
           <w:sz w:val="24"/>
         </w:rPr>
-        <w:t>Discuss the accuracy of your resistance measurements and any adjustments you needed to do to get a more accurate measurement.</w:t>
+        <w:lastRenderedPageBreak/>
+        <w:t xml:space="preserve">Discuss the accuracy of your resistance measurements and any adjustments you </w:t>
+      </w:r>
+      <w:proofErr w:type="gramStart"/>
+      <w:r>
+        <w:rPr>
+          <w:i/>
+          <w:iCs/>
+          <w:sz w:val="24"/>
+        </w:rPr>
+        <w:t>needed</w:t>
+      </w:r>
+      <w:proofErr w:type="gramEnd"/>
+      <w:r>
+        <w:rPr>
+          <w:i/>
+          <w:iCs/>
+          <w:sz w:val="24"/>
+        </w:rPr>
+        <w:t xml:space="preserve"> to </w:t>
+      </w:r>
+      <w:proofErr w:type="gramStart"/>
+      <w:r>
+        <w:rPr>
+          <w:i/>
+          <w:iCs/>
+          <w:sz w:val="24"/>
+        </w:rPr>
+        <w:t>do</w:t>
+      </w:r>
+      <w:proofErr w:type="gramEnd"/>
+      <w:r>
+        <w:rPr>
+          <w:i/>
+          <w:iCs/>
+          <w:sz w:val="24"/>
+        </w:rPr>
+        <w:t xml:space="preserve"> to get a more accurate measurement.</w:t>
       </w:r>
     </w:p>
     <w:p>

</xml_diff>